<commit_message>
feat: report detector coverage by capabilities
</commit_message>
<xml_diff>
--- a/fixtures/labeled/contract_06_address.docx
+++ b/fixtures/labeled/contract_06_address.docx
@@ -67,6 +67,14 @@
           <w:sz w:val="22"/>
         </w:rPr>
         <w:t>Адрес: 394018, г. Воронеж, ул. Кирова, д. 4, оф. 12, ИНН 3662103003</w:t>
+      </w:r>
+    </w:p>
+    <w:p>
+      <w:r>
+        <w:rPr>
+          <w:sz w:val="22"/>
+        </w:rPr>
+        <w:t>ИНН: 312822458000 , адрес регистрации по месту жительства: 394024, Воронежская область, г Воронеж, пер Здоровья, д 86а, кв 95 ) Атараев Б.М., именуемый в дальнейшем «Продавец»</w:t>
       </w:r>
     </w:p>
     <w:tbl>

</xml_diff>